<commit_message>
feat: implement core agent loop, tool dispatcher, and sandbox execution environment
</commit_message>
<xml_diff>
--- a/backend/workspace/summary_of_today_s_findings.docx
+++ b/backend/workspace/summary_of_today_s_findings.docx
@@ -12,7 +12,12 @@
     </w:p>
     <w:p>
       <w:r>
-        <w:t>Findings: The report is currently being generated. Recommendation: The report will be generated based on the findings. The report will be saved as 'summary_of_today_s_findings.docx'.</w:t>
+        <w:t>Findings: [insert findings here]</w:t>
+      </w:r>
+    </w:p>
+    <w:p>
+      <w:r>
+        <w:t>Recommendation: [insert recommendation here]</w:t>
       </w:r>
     </w:p>
     <w:sectPr>

</xml_diff>

<commit_message>
feat: implement typed API client for streaming agent interactions and establish codebase development guidelines
</commit_message>
<xml_diff>
--- a/backend/workspace/summary_of_today_s_findings.docx
+++ b/backend/workspace/summary_of_today_s_findings.docx
@@ -12,12 +12,7 @@
     </w:p>
     <w:p>
       <w:r>
-        <w:t>Findings: [insert findings here]</w:t>
-      </w:r>
-    </w:p>
-    <w:p>
-      <w:r>
-        <w:t>Recommendation: [insert recommendation here]</w:t>
+        <w:t>Findings: The report is now saved as summary_of_today_s_findings.docx. Please review and edit as needed.</w:t>
       </w:r>
     </w:p>
     <w:sectPr>

</xml_diff>